<commit_message>
completed creating all tables
</commit_message>
<xml_diff>
--- a/DBMS/DBMS_LAB_1_12_AUGUST_2026.docx
+++ b/DBMS/DBMS_LAB_1_12_AUGUST_2026.docx
@@ -4,6 +4,10 @@
   <w:body>
     <w:p>
       <w:r>
+        <w:rPr>
+          <w:noProof/>
+          <w:lang w:eastAsia="en-IN"/>
+        </w:rPr>
         <w:drawing>
           <wp:inline distT="0" distB="0" distL="0" distR="0" wp14:anchorId="7580E83F" wp14:editId="4D44B00D">
             <wp:extent cx="3620005" cy="1219370"/>
@@ -43,6 +47,10 @@
     </w:p>
     <w:p>
       <w:r>
+        <w:rPr>
+          <w:noProof/>
+          <w:lang w:eastAsia="en-IN"/>
+        </w:rPr>
         <w:drawing>
           <wp:inline distT="0" distB="0" distL="0" distR="0" wp14:anchorId="03B870BC" wp14:editId="2E5BAA99">
             <wp:extent cx="3715268" cy="1314633"/>
@@ -82,6 +90,10 @@
     </w:p>
     <w:p>
       <w:r>
+        <w:rPr>
+          <w:noProof/>
+          <w:lang w:eastAsia="en-IN"/>
+        </w:rPr>
         <w:drawing>
           <wp:inline distT="0" distB="0" distL="0" distR="0" wp14:anchorId="408B2D0D" wp14:editId="20E846E5">
             <wp:extent cx="4039164" cy="1314633"/>
@@ -121,6 +133,10 @@
     </w:p>
     <w:p>
       <w:r>
+        <w:rPr>
+          <w:noProof/>
+          <w:lang w:eastAsia="en-IN"/>
+        </w:rPr>
         <w:drawing>
           <wp:inline distT="0" distB="0" distL="0" distR="0" wp14:anchorId="5C2E55D3" wp14:editId="5C7E7749">
             <wp:extent cx="3248478" cy="1105054"/>
@@ -161,6 +177,10 @@
     <w:p/>
     <w:p>
       <w:r>
+        <w:rPr>
+          <w:noProof/>
+          <w:lang w:eastAsia="en-IN"/>
+        </w:rPr>
         <w:drawing>
           <wp:inline distT="0" distB="0" distL="0" distR="0" wp14:anchorId="2CD4C2E5" wp14:editId="004BF069">
             <wp:extent cx="3639058" cy="1162212"/>
@@ -201,6 +221,10 @@
     <w:p/>
     <w:p>
       <w:r>
+        <w:rPr>
+          <w:noProof/>
+          <w:lang w:eastAsia="en-IN"/>
+        </w:rPr>
         <w:drawing>
           <wp:inline distT="0" distB="0" distL="0" distR="0" wp14:anchorId="5B0FE0BB" wp14:editId="0AEA649E">
             <wp:extent cx="3267531" cy="1247949"/>
@@ -241,6 +265,10 @@
     <w:p/>
     <w:p>
       <w:r>
+        <w:rPr>
+          <w:noProof/>
+          <w:lang w:eastAsia="en-IN"/>
+        </w:rPr>
         <w:lastRenderedPageBreak/>
         <w:drawing>
           <wp:inline distT="0" distB="0" distL="0" distR="0" wp14:anchorId="047E9DF4" wp14:editId="6E420203">
@@ -279,7 +307,123 @@
         </w:drawing>
       </w:r>
     </w:p>
-    <w:p/>
+    <w:p>
+      <w:r>
+        <w:drawing>
+          <wp:inline distT="0" distB="0" distL="0" distR="0" wp14:anchorId="149E3365" wp14:editId="1DF69620">
+            <wp:extent cx="3524742" cy="1124107"/>
+            <wp:effectExtent l="0" t="0" r="0" b="0"/>
+            <wp:docPr id="8" name="Picture 8"/>
+            <wp:cNvGraphicFramePr>
+              <a:graphicFrameLocks xmlns:a="http://schemas.openxmlformats.org/drawingml/2006/main" noChangeAspect="1"/>
+            </wp:cNvGraphicFramePr>
+            <a:graphic xmlns:a="http://schemas.openxmlformats.org/drawingml/2006/main">
+              <a:graphicData uri="http://schemas.openxmlformats.org/drawingml/2006/picture">
+                <pic:pic xmlns:pic="http://schemas.openxmlformats.org/drawingml/2006/picture">
+                  <pic:nvPicPr>
+                    <pic:cNvPr id="1" name=""/>
+                    <pic:cNvPicPr/>
+                  </pic:nvPicPr>
+                  <pic:blipFill>
+                    <a:blip r:embed="rId11"/>
+                    <a:stretch>
+                      <a:fillRect/>
+                    </a:stretch>
+                  </pic:blipFill>
+                  <pic:spPr>
+                    <a:xfrm>
+                      <a:off x="0" y="0"/>
+                      <a:ext cx="3524742" cy="1124107"/>
+                    </a:xfrm>
+                    <a:prstGeom prst="rect">
+                      <a:avLst/>
+                    </a:prstGeom>
+                  </pic:spPr>
+                </pic:pic>
+              </a:graphicData>
+            </a:graphic>
+          </wp:inline>
+        </w:drawing>
+      </w:r>
+    </w:p>
+    <w:p>
+      <w:r>
+        <w:drawing>
+          <wp:inline distT="0" distB="0" distL="0" distR="0" wp14:anchorId="707305B4" wp14:editId="094CF04E">
+            <wp:extent cx="3915321" cy="1076475"/>
+            <wp:effectExtent l="0" t="0" r="9525" b="9525"/>
+            <wp:docPr id="9" name="Picture 9"/>
+            <wp:cNvGraphicFramePr>
+              <a:graphicFrameLocks xmlns:a="http://schemas.openxmlformats.org/drawingml/2006/main" noChangeAspect="1"/>
+            </wp:cNvGraphicFramePr>
+            <a:graphic xmlns:a="http://schemas.openxmlformats.org/drawingml/2006/main">
+              <a:graphicData uri="http://schemas.openxmlformats.org/drawingml/2006/picture">
+                <pic:pic xmlns:pic="http://schemas.openxmlformats.org/drawingml/2006/picture">
+                  <pic:nvPicPr>
+                    <pic:cNvPr id="1" name=""/>
+                    <pic:cNvPicPr/>
+                  </pic:nvPicPr>
+                  <pic:blipFill>
+                    <a:blip r:embed="rId12"/>
+                    <a:stretch>
+                      <a:fillRect/>
+                    </a:stretch>
+                  </pic:blipFill>
+                  <pic:spPr>
+                    <a:xfrm>
+                      <a:off x="0" y="0"/>
+                      <a:ext cx="3915321" cy="1076475"/>
+                    </a:xfrm>
+                    <a:prstGeom prst="rect">
+                      <a:avLst/>
+                    </a:prstGeom>
+                  </pic:spPr>
+                </pic:pic>
+              </a:graphicData>
+            </a:graphic>
+          </wp:inline>
+        </w:drawing>
+      </w:r>
+    </w:p>
+    <w:p>
+      <w:r>
+        <w:drawing>
+          <wp:inline distT="0" distB="0" distL="0" distR="0" wp14:anchorId="1954FFEB" wp14:editId="00A3693A">
+            <wp:extent cx="3829584" cy="1238423"/>
+            <wp:effectExtent l="0" t="0" r="0" b="0"/>
+            <wp:docPr id="10" name="Picture 10"/>
+            <wp:cNvGraphicFramePr>
+              <a:graphicFrameLocks xmlns:a="http://schemas.openxmlformats.org/drawingml/2006/main" noChangeAspect="1"/>
+            </wp:cNvGraphicFramePr>
+            <a:graphic xmlns:a="http://schemas.openxmlformats.org/drawingml/2006/main">
+              <a:graphicData uri="http://schemas.openxmlformats.org/drawingml/2006/picture">
+                <pic:pic xmlns:pic="http://schemas.openxmlformats.org/drawingml/2006/picture">
+                  <pic:nvPicPr>
+                    <pic:cNvPr id="1" name=""/>
+                    <pic:cNvPicPr/>
+                  </pic:nvPicPr>
+                  <pic:blipFill>
+                    <a:blip r:embed="rId13"/>
+                    <a:stretch>
+                      <a:fillRect/>
+                    </a:stretch>
+                  </pic:blipFill>
+                  <pic:spPr>
+                    <a:xfrm>
+                      <a:off x="0" y="0"/>
+                      <a:ext cx="3829584" cy="1238423"/>
+                    </a:xfrm>
+                    <a:prstGeom prst="rect">
+                      <a:avLst/>
+                    </a:prstGeom>
+                  </pic:spPr>
+                </pic:pic>
+              </a:graphicData>
+            </a:graphic>
+          </wp:inline>
+        </w:drawing>
+      </w:r>
+    </w:p>
     <w:p>
       <w:r>
         <w:t>create database AARYAN_RAORANE_S004;</w:t>
@@ -299,28 +443,93 @@
     </w:p>
     <w:p>
       <w:r>
-        <w:t>(s_id int primary key,</w:t>
-      </w:r>
-    </w:p>
-    <w:p>
-      <w:r>
-        <w:t>s_name varchar(30) not null,</w:t>
-      </w:r>
-    </w:p>
-    <w:p>
-      <w:r>
-        <w:t>s_gender char(1) check (s_gender='M' or s_gender='F'),</w:t>
-      </w:r>
-    </w:p>
-    <w:p>
-      <w:r>
-        <w:t>s_age int,</w:t>
-      </w:r>
-    </w:p>
-    <w:p>
-      <w:r>
-        <w:t>m_id int</w:t>
-      </w:r>
+        <w:t>(</w:t>
+      </w:r>
+      <w:proofErr w:type="spellStart"/>
+      <w:r>
+        <w:t>s_id</w:t>
+      </w:r>
+      <w:proofErr w:type="spellEnd"/>
+      <w:r>
+        <w:t xml:space="preserve"> </w:t>
+      </w:r>
+      <w:proofErr w:type="spellStart"/>
+      <w:r>
+        <w:t>int</w:t>
+      </w:r>
+      <w:proofErr w:type="spellEnd"/>
+      <w:r>
+        <w:t xml:space="preserve"> primary key,</w:t>
+      </w:r>
+    </w:p>
+    <w:p>
+      <w:proofErr w:type="spellStart"/>
+      <w:r>
+        <w:t>s_name</w:t>
+      </w:r>
+      <w:proofErr w:type="spellEnd"/>
+      <w:r>
+        <w:t xml:space="preserve"> varchar(30) not null,</w:t>
+      </w:r>
+    </w:p>
+    <w:p>
+      <w:proofErr w:type="spellStart"/>
+      <w:r>
+        <w:t>s_gender</w:t>
+      </w:r>
+      <w:proofErr w:type="spellEnd"/>
+      <w:r>
+        <w:t xml:space="preserve"> char(1) check (</w:t>
+      </w:r>
+      <w:proofErr w:type="spellStart"/>
+      <w:r>
+        <w:t>s_gender</w:t>
+      </w:r>
+      <w:proofErr w:type="spellEnd"/>
+      <w:r>
+        <w:t xml:space="preserve">='M' or </w:t>
+      </w:r>
+      <w:proofErr w:type="spellStart"/>
+      <w:r>
+        <w:t>s_gender</w:t>
+      </w:r>
+      <w:proofErr w:type="spellEnd"/>
+      <w:r>
+        <w:t>='F'),</w:t>
+      </w:r>
+    </w:p>
+    <w:p>
+      <w:proofErr w:type="spellStart"/>
+      <w:r>
+        <w:t>s_age</w:t>
+      </w:r>
+      <w:proofErr w:type="spellEnd"/>
+      <w:r>
+        <w:t xml:space="preserve"> </w:t>
+      </w:r>
+      <w:proofErr w:type="spellStart"/>
+      <w:r>
+        <w:t>int</w:t>
+      </w:r>
+      <w:proofErr w:type="spellEnd"/>
+      <w:r>
+        <w:t>,</w:t>
+      </w:r>
+    </w:p>
+    <w:p>
+      <w:proofErr w:type="spellStart"/>
+      <w:r>
+        <w:t>m_id</w:t>
+      </w:r>
+      <w:proofErr w:type="spellEnd"/>
+      <w:r>
+        <w:t xml:space="preserve"> </w:t>
+      </w:r>
+      <w:proofErr w:type="spellStart"/>
+      <w:r>
+        <w:t>int</w:t>
+      </w:r>
+      <w:proofErr w:type="spellEnd"/>
     </w:p>
     <w:p>
       <w:r>
@@ -336,38 +545,93 @@
     <w:p/>
     <w:p>
       <w:r>
+        <w:lastRenderedPageBreak/>
         <w:t>create table mentor</w:t>
       </w:r>
     </w:p>
     <w:p>
       <w:r>
-        <w:t>(m_id int primary key,</w:t>
-      </w:r>
-    </w:p>
-    <w:p>
-      <w:r>
-        <w:t>m_first_name varchar(30) not null,</w:t>
-      </w:r>
-    </w:p>
-    <w:p>
-      <w:r>
-        <w:t>m_middle_name varchar(30) not null,</w:t>
-      </w:r>
-    </w:p>
-    <w:p>
-      <w:r>
-        <w:t>m_last_name varchar(30) not null,</w:t>
-      </w:r>
-    </w:p>
-    <w:p>
-      <w:r>
-        <w:t>m_contact int,</w:t>
-      </w:r>
-    </w:p>
-    <w:p>
-      <w:r>
-        <w:t>m_exp int</w:t>
-      </w:r>
+        <w:t>(</w:t>
+      </w:r>
+      <w:proofErr w:type="spellStart"/>
+      <w:r>
+        <w:t>m_id</w:t>
+      </w:r>
+      <w:proofErr w:type="spellEnd"/>
+      <w:r>
+        <w:t xml:space="preserve"> </w:t>
+      </w:r>
+      <w:proofErr w:type="spellStart"/>
+      <w:r>
+        <w:t>int</w:t>
+      </w:r>
+      <w:proofErr w:type="spellEnd"/>
+      <w:r>
+        <w:t xml:space="preserve"> primary key,</w:t>
+      </w:r>
+    </w:p>
+    <w:p>
+      <w:proofErr w:type="spellStart"/>
+      <w:r>
+        <w:t>m_first_name</w:t>
+      </w:r>
+      <w:proofErr w:type="spellEnd"/>
+      <w:r>
+        <w:t xml:space="preserve"> varchar(30) not null,</w:t>
+      </w:r>
+    </w:p>
+    <w:p>
+      <w:proofErr w:type="spellStart"/>
+      <w:r>
+        <w:t>m_middle_name</w:t>
+      </w:r>
+      <w:proofErr w:type="spellEnd"/>
+      <w:r>
+        <w:t xml:space="preserve"> varchar(30) not null,</w:t>
+      </w:r>
+    </w:p>
+    <w:p>
+      <w:proofErr w:type="spellStart"/>
+      <w:r>
+        <w:t>m_last_name</w:t>
+      </w:r>
+      <w:proofErr w:type="spellEnd"/>
+      <w:r>
+        <w:t xml:space="preserve"> varchar(30) not null,</w:t>
+      </w:r>
+    </w:p>
+    <w:p>
+      <w:proofErr w:type="spellStart"/>
+      <w:r>
+        <w:t>m_contact</w:t>
+      </w:r>
+      <w:proofErr w:type="spellEnd"/>
+      <w:r>
+        <w:t xml:space="preserve"> </w:t>
+      </w:r>
+      <w:proofErr w:type="spellStart"/>
+      <w:r>
+        <w:t>int</w:t>
+      </w:r>
+      <w:proofErr w:type="spellEnd"/>
+      <w:r>
+        <w:t>,</w:t>
+      </w:r>
+    </w:p>
+    <w:p>
+      <w:proofErr w:type="spellStart"/>
+      <w:r>
+        <w:t>m_exp</w:t>
+      </w:r>
+      <w:proofErr w:type="spellEnd"/>
+      <w:r>
+        <w:t xml:space="preserve"> </w:t>
+      </w:r>
+      <w:proofErr w:type="spellStart"/>
+      <w:r>
+        <w:t>int</w:t>
+      </w:r>
+      <w:proofErr w:type="spellEnd"/>
     </w:p>
     <w:p>
       <w:r>
@@ -388,24 +652,247 @@
     </w:p>
     <w:p>
       <w:r>
+        <w:t>(</w:t>
+      </w:r>
+      <w:proofErr w:type="spellStart"/>
+      <w:r>
+        <w:t>sub_code</w:t>
+      </w:r>
+      <w:proofErr w:type="spellEnd"/>
+      <w:r>
+        <w:t xml:space="preserve"> varchar(15) primary key,</w:t>
+      </w:r>
+    </w:p>
+    <w:p>
+      <w:proofErr w:type="spellStart"/>
+      <w:r>
+        <w:t>sub_name</w:t>
+      </w:r>
+      <w:proofErr w:type="spellEnd"/>
+      <w:r>
+        <w:t xml:space="preserve"> varchar(15),</w:t>
+      </w:r>
+    </w:p>
+    <w:p>
+      <w:proofErr w:type="spellStart"/>
+      <w:r>
+        <w:t>sub_credit</w:t>
+      </w:r>
+      <w:proofErr w:type="spellEnd"/>
+      <w:r>
+        <w:t xml:space="preserve"> float,</w:t>
+      </w:r>
+    </w:p>
+    <w:p>
+      <w:proofErr w:type="spellStart"/>
+      <w:r>
+        <w:t>s_id</w:t>
+      </w:r>
+      <w:proofErr w:type="spellEnd"/>
+      <w:r>
+        <w:t xml:space="preserve"> </w:t>
+      </w:r>
+      <w:proofErr w:type="spellStart"/>
+      <w:r>
+        <w:t>int</w:t>
+      </w:r>
+      <w:proofErr w:type="spellEnd"/>
+    </w:p>
+    <w:p>
+      <w:r>
+        <w:t>);</w:t>
+      </w:r>
+    </w:p>
+    <w:p/>
+    <w:p>
+      <w:r>
+        <w:t>describe subject;</w:t>
+      </w:r>
+    </w:p>
+    <w:p/>
+    <w:p>
+      <w:r>
+        <w:t>create table resources</w:t>
+      </w:r>
+    </w:p>
+    <w:p>
+      <w:r>
+        <w:t>(</w:t>
+      </w:r>
+      <w:proofErr w:type="spellStart"/>
+      <w:r>
+        <w:t>r_no</w:t>
+      </w:r>
+      <w:proofErr w:type="spellEnd"/>
+      <w:r>
+        <w:t xml:space="preserve"> </w:t>
+      </w:r>
+      <w:proofErr w:type="spellStart"/>
+      <w:r>
+        <w:t>int</w:t>
+      </w:r>
+      <w:proofErr w:type="spellEnd"/>
+      <w:r>
+        <w:t xml:space="preserve"> primary key,</w:t>
+      </w:r>
+    </w:p>
+    <w:p>
+      <w:proofErr w:type="spellStart"/>
+      <w:r>
+        <w:t>r_type</w:t>
+      </w:r>
+      <w:proofErr w:type="spellEnd"/>
+      <w:r>
+        <w:t xml:space="preserve"> varchar(15),</w:t>
+      </w:r>
+    </w:p>
+    <w:p>
+      <w:proofErr w:type="spellStart"/>
+      <w:r>
+        <w:t>sub_code</w:t>
+      </w:r>
+      <w:proofErr w:type="spellEnd"/>
+      <w:r>
+        <w:t xml:space="preserve"> varchar(15),</w:t>
+      </w:r>
+    </w:p>
+    <w:p>
+      <w:proofErr w:type="spellStart"/>
+      <w:r>
+        <w:t>s_id</w:t>
+      </w:r>
+      <w:proofErr w:type="spellEnd"/>
+      <w:r>
+        <w:t xml:space="preserve"> </w:t>
+      </w:r>
+      <w:proofErr w:type="spellStart"/>
+      <w:r>
+        <w:t>int</w:t>
+      </w:r>
+      <w:proofErr w:type="spellEnd"/>
+      <w:r>
+        <w:t>,</w:t>
+      </w:r>
+    </w:p>
+    <w:p>
+      <w:proofErr w:type="spellStart"/>
+      <w:r>
+        <w:t>m_id</w:t>
+      </w:r>
+      <w:proofErr w:type="spellEnd"/>
+      <w:r>
+        <w:t xml:space="preserve"> </w:t>
+      </w:r>
+      <w:proofErr w:type="spellStart"/>
+      <w:r>
+        <w:t>int</w:t>
+      </w:r>
+      <w:proofErr w:type="spellEnd"/>
+    </w:p>
+    <w:p>
+      <w:r>
+        <w:t>);</w:t>
+      </w:r>
+    </w:p>
+    <w:p/>
+    <w:p>
+      <w:r>
+        <w:t>describe resources;</w:t>
+      </w:r>
+    </w:p>
+    <w:p/>
+    <w:p>
+      <w:r>
+        <w:t xml:space="preserve">create table </w:t>
+      </w:r>
+      <w:proofErr w:type="spellStart"/>
+      <w:r>
+        <w:t>study_pattern</w:t>
+      </w:r>
+      <w:proofErr w:type="spellEnd"/>
+    </w:p>
+    <w:p>
+      <w:r>
         <w:lastRenderedPageBreak/>
-        <w:t>(sub_code varchar(15) primary key,</w:t>
-      </w:r>
-    </w:p>
-    <w:p>
-      <w:r>
-        <w:t>sub_name varchar(15),</w:t>
-      </w:r>
-    </w:p>
-    <w:p>
-      <w:r>
-        <w:t>sub_credit float,</w:t>
-      </w:r>
-    </w:p>
-    <w:p>
-      <w:r>
-        <w:t>s_id int</w:t>
-      </w:r>
+        <w:t>(</w:t>
+      </w:r>
+      <w:proofErr w:type="spellStart"/>
+      <w:r>
+        <w:t>sp_no</w:t>
+      </w:r>
+      <w:proofErr w:type="spellEnd"/>
+      <w:r>
+        <w:t xml:space="preserve"> </w:t>
+      </w:r>
+      <w:proofErr w:type="spellStart"/>
+      <w:r>
+        <w:t>int</w:t>
+      </w:r>
+      <w:proofErr w:type="spellEnd"/>
+      <w:r>
+        <w:t xml:space="preserve"> primary key,</w:t>
+      </w:r>
+    </w:p>
+    <w:p>
+      <w:proofErr w:type="spellStart"/>
+      <w:r>
+        <w:t>sp_methodology</w:t>
+      </w:r>
+      <w:proofErr w:type="spellEnd"/>
+      <w:r>
+        <w:t xml:space="preserve"> varchar(20),</w:t>
+      </w:r>
+    </w:p>
+    <w:p>
+      <w:proofErr w:type="spellStart"/>
+      <w:r>
+        <w:t>sp_hours</w:t>
+      </w:r>
+      <w:proofErr w:type="spellEnd"/>
+      <w:r>
+        <w:t xml:space="preserve"> </w:t>
+      </w:r>
+      <w:proofErr w:type="spellStart"/>
+      <w:r>
+        <w:t>int</w:t>
+      </w:r>
+      <w:proofErr w:type="spellEnd"/>
+      <w:r>
+        <w:t>,</w:t>
+      </w:r>
+    </w:p>
+    <w:p>
+      <w:proofErr w:type="spellStart"/>
+      <w:r>
+        <w:t>s_id</w:t>
+      </w:r>
+      <w:proofErr w:type="spellEnd"/>
+      <w:r>
+        <w:t xml:space="preserve"> </w:t>
+      </w:r>
+      <w:proofErr w:type="spellStart"/>
+      <w:r>
+        <w:t>int</w:t>
+      </w:r>
+      <w:proofErr w:type="spellEnd"/>
+      <w:r>
+        <w:t>,</w:t>
+      </w:r>
+    </w:p>
+    <w:p>
+      <w:proofErr w:type="spellStart"/>
+      <w:r>
+        <w:t>m_id</w:t>
+      </w:r>
+      <w:proofErr w:type="spellEnd"/>
+      <w:r>
+        <w:t xml:space="preserve"> </w:t>
+      </w:r>
+      <w:proofErr w:type="spellStart"/>
+      <w:r>
+        <w:t>int</w:t>
+      </w:r>
+      <w:proofErr w:type="spellEnd"/>
     </w:p>
     <w:p>
       <w:r>
@@ -415,39 +902,114 @@
     <w:p/>
     <w:p>
       <w:r>
-        <w:t>describe subject;</w:t>
-      </w:r>
-    </w:p>
-    <w:p/>
-    <w:p>
-      <w:r>
-        <w:t>create table resources</w:t>
-      </w:r>
-    </w:p>
-    <w:p>
-      <w:r>
-        <w:t>(r_no int primary key,</w:t>
-      </w:r>
-    </w:p>
-    <w:p>
-      <w:r>
-        <w:t>r_type varchar(15),</w:t>
-      </w:r>
-    </w:p>
-    <w:p>
-      <w:r>
-        <w:t>sub_code varchar(15),</w:t>
-      </w:r>
-    </w:p>
-    <w:p>
-      <w:r>
-        <w:t>s_id int,</w:t>
-      </w:r>
-    </w:p>
-    <w:p>
-      <w:r>
-        <w:t>m_id int</w:t>
-      </w:r>
+        <w:t xml:space="preserve">describe </w:t>
+      </w:r>
+      <w:proofErr w:type="spellStart"/>
+      <w:r>
+        <w:t>study_pattern</w:t>
+      </w:r>
+      <w:proofErr w:type="spellEnd"/>
+      <w:r>
+        <w:t>;</w:t>
+      </w:r>
+    </w:p>
+    <w:p/>
+    <w:p>
+      <w:r>
+        <w:t>create table test</w:t>
+      </w:r>
+    </w:p>
+    <w:p>
+      <w:r>
+        <w:t>(</w:t>
+      </w:r>
+      <w:proofErr w:type="spellStart"/>
+      <w:r>
+        <w:t>t_id</w:t>
+      </w:r>
+      <w:proofErr w:type="spellEnd"/>
+      <w:r>
+        <w:t xml:space="preserve"> </w:t>
+      </w:r>
+      <w:proofErr w:type="spellStart"/>
+      <w:r>
+        <w:t>int</w:t>
+      </w:r>
+      <w:proofErr w:type="spellEnd"/>
+      <w:r>
+        <w:t xml:space="preserve"> primary key,</w:t>
+      </w:r>
+    </w:p>
+    <w:p>
+      <w:proofErr w:type="spellStart"/>
+      <w:r>
+        <w:t>t_type</w:t>
+      </w:r>
+      <w:proofErr w:type="spellEnd"/>
+      <w:r>
+        <w:t xml:space="preserve"> varchar(20),</w:t>
+      </w:r>
+    </w:p>
+    <w:p>
+      <w:proofErr w:type="spellStart"/>
+      <w:r>
+        <w:t>t_marks</w:t>
+      </w:r>
+      <w:proofErr w:type="spellEnd"/>
+      <w:r>
+        <w:t xml:space="preserve"> </w:t>
+      </w:r>
+      <w:proofErr w:type="spellStart"/>
+      <w:r>
+        <w:t>int</w:t>
+      </w:r>
+      <w:proofErr w:type="spellEnd"/>
+      <w:r>
+        <w:t>,</w:t>
+      </w:r>
+    </w:p>
+    <w:p>
+      <w:proofErr w:type="spellStart"/>
+      <w:r>
+        <w:t>sub_code</w:t>
+      </w:r>
+      <w:proofErr w:type="spellEnd"/>
+      <w:r>
+        <w:t xml:space="preserve"> varchar(15),</w:t>
+      </w:r>
+    </w:p>
+    <w:p>
+      <w:proofErr w:type="spellStart"/>
+      <w:r>
+        <w:t>s_id</w:t>
+      </w:r>
+      <w:proofErr w:type="spellEnd"/>
+      <w:r>
+        <w:t xml:space="preserve"> </w:t>
+      </w:r>
+      <w:proofErr w:type="spellStart"/>
+      <w:r>
+        <w:t>int</w:t>
+      </w:r>
+      <w:proofErr w:type="spellEnd"/>
+      <w:r>
+        <w:t>,</w:t>
+      </w:r>
+    </w:p>
+    <w:p>
+      <w:proofErr w:type="spellStart"/>
+      <w:r>
+        <w:t>m_id</w:t>
+      </w:r>
+      <w:proofErr w:type="spellEnd"/>
+      <w:r>
+        <w:t xml:space="preserve"> </w:t>
+      </w:r>
+      <w:proofErr w:type="spellStart"/>
+      <w:r>
+        <w:t>int</w:t>
+      </w:r>
+      <w:proofErr w:type="spellEnd"/>
     </w:p>
     <w:p>
       <w:r>
@@ -457,39 +1019,78 @@
     <w:p/>
     <w:p>
       <w:r>
-        <w:t>describe resources;</w:t>
-      </w:r>
-    </w:p>
-    <w:p/>
-    <w:p>
-      <w:r>
-        <w:t>create table study_pattern</w:t>
-      </w:r>
-    </w:p>
-    <w:p>
-      <w:r>
-        <w:t>(sp_no int primary key,</w:t>
-      </w:r>
-    </w:p>
-    <w:p>
-      <w:r>
-        <w:t>sp_methodology varchar(20),</w:t>
-      </w:r>
-    </w:p>
-    <w:p>
-      <w:r>
-        <w:t>sp_hours int,</w:t>
-      </w:r>
-    </w:p>
-    <w:p>
-      <w:r>
-        <w:t>s_id int,</w:t>
-      </w:r>
-    </w:p>
-    <w:p>
-      <w:r>
-        <w:t>m_id int</w:t>
-      </w:r>
+        <w:t>describe test;</w:t>
+      </w:r>
+    </w:p>
+    <w:p/>
+    <w:p>
+      <w:r>
+        <w:t>create table grades</w:t>
+      </w:r>
+    </w:p>
+    <w:p>
+      <w:r>
+        <w:t>(</w:t>
+      </w:r>
+      <w:proofErr w:type="spellStart"/>
+      <w:r>
+        <w:t>g_id</w:t>
+      </w:r>
+      <w:proofErr w:type="spellEnd"/>
+      <w:r>
+        <w:t xml:space="preserve"> </w:t>
+      </w:r>
+      <w:proofErr w:type="spellStart"/>
+      <w:r>
+        <w:t>int</w:t>
+      </w:r>
+      <w:proofErr w:type="spellEnd"/>
+      <w:r>
+        <w:t xml:space="preserve"> primary key,</w:t>
+      </w:r>
+    </w:p>
+    <w:p>
+      <w:proofErr w:type="spellStart"/>
+      <w:r>
+        <w:t>g_type</w:t>
+      </w:r>
+      <w:proofErr w:type="spellEnd"/>
+      <w:r>
+        <w:t xml:space="preserve"> varchar(20),</w:t>
+      </w:r>
+    </w:p>
+    <w:p>
+      <w:proofErr w:type="spellStart"/>
+      <w:r>
+        <w:t>s_id</w:t>
+      </w:r>
+      <w:proofErr w:type="spellEnd"/>
+      <w:r>
+        <w:t xml:space="preserve"> </w:t>
+      </w:r>
+      <w:proofErr w:type="spellStart"/>
+      <w:r>
+        <w:t>int</w:t>
+      </w:r>
+      <w:proofErr w:type="spellEnd"/>
+      <w:r>
+        <w:t>,</w:t>
+      </w:r>
+    </w:p>
+    <w:p>
+      <w:proofErr w:type="spellStart"/>
+      <w:r>
+        <w:t>t_id</w:t>
+      </w:r>
+      <w:proofErr w:type="spellEnd"/>
+      <w:r>
+        <w:t xml:space="preserve"> </w:t>
+      </w:r>
+      <w:proofErr w:type="spellStart"/>
+      <w:r>
+        <w:t>int</w:t>
+      </w:r>
+      <w:proofErr w:type="spellEnd"/>
     </w:p>
     <w:p>
       <w:r>
@@ -499,45 +1100,91 @@
     <w:p/>
     <w:p>
       <w:r>
-        <w:t>describe study_pattern;</w:t>
-      </w:r>
-    </w:p>
-    <w:p/>
-    <w:p>
-      <w:r>
-        <w:t>create table test</w:t>
-      </w:r>
-    </w:p>
-    <w:p>
-      <w:r>
-        <w:t>(t_id int primary key,</w:t>
-      </w:r>
-    </w:p>
-    <w:p>
-      <w:r>
-        <w:t>t_type varchar(20),</w:t>
-      </w:r>
-    </w:p>
-    <w:p>
+        <w:t>describe grades;</w:t>
+      </w:r>
+    </w:p>
+    <w:p/>
+    <w:p>
+      <w:r>
+        <w:t>create table skills</w:t>
+      </w:r>
+    </w:p>
+    <w:p>
+      <w:r>
+        <w:t>(</w:t>
+      </w:r>
+    </w:p>
+    <w:p>
+      <w:proofErr w:type="spellStart"/>
       <w:r>
         <w:lastRenderedPageBreak/>
-        <w:t>t_marks int,</w:t>
-      </w:r>
-    </w:p>
-    <w:p>
-      <w:r>
-        <w:t>sub_code varchar(15),</w:t>
-      </w:r>
-    </w:p>
-    <w:p>
-      <w:r>
-        <w:t>s_id int,</w:t>
-      </w:r>
-    </w:p>
-    <w:p>
-      <w:r>
-        <w:t>m_id int</w:t>
-      </w:r>
+        <w:t>skill_id</w:t>
+      </w:r>
+      <w:proofErr w:type="spellEnd"/>
+      <w:r>
+        <w:t xml:space="preserve"> </w:t>
+      </w:r>
+      <w:proofErr w:type="spellStart"/>
+      <w:r>
+        <w:t>int</w:t>
+      </w:r>
+      <w:proofErr w:type="spellEnd"/>
+      <w:r>
+        <w:t xml:space="preserve"> primary key,</w:t>
+      </w:r>
+    </w:p>
+    <w:p>
+      <w:proofErr w:type="spellStart"/>
+      <w:r>
+        <w:t>skill_name</w:t>
+      </w:r>
+      <w:proofErr w:type="spellEnd"/>
+      <w:r>
+        <w:t xml:space="preserve"> varchar(20),</w:t>
+      </w:r>
+    </w:p>
+    <w:p>
+      <w:proofErr w:type="spellStart"/>
+      <w:r>
+        <w:t>skill_type</w:t>
+      </w:r>
+      <w:proofErr w:type="spellEnd"/>
+      <w:r>
+        <w:t xml:space="preserve"> varchar(20),</w:t>
+      </w:r>
+    </w:p>
+    <w:p>
+      <w:proofErr w:type="spellStart"/>
+      <w:r>
+        <w:t>skill_proficiency</w:t>
+      </w:r>
+      <w:proofErr w:type="spellEnd"/>
+      <w:r>
+        <w:t xml:space="preserve"> </w:t>
+      </w:r>
+      <w:proofErr w:type="spellStart"/>
+      <w:r>
+        <w:t>int</w:t>
+      </w:r>
+      <w:proofErr w:type="spellEnd"/>
+      <w:r>
+        <w:t>,</w:t>
+      </w:r>
+    </w:p>
+    <w:p>
+      <w:proofErr w:type="spellStart"/>
+      <w:r>
+        <w:t>s_id</w:t>
+      </w:r>
+      <w:proofErr w:type="spellEnd"/>
+      <w:r>
+        <w:t xml:space="preserve"> </w:t>
+      </w:r>
+      <w:proofErr w:type="spellStart"/>
+      <w:r>
+        <w:t>int</w:t>
+      </w:r>
+      <w:proofErr w:type="spellEnd"/>
     </w:p>
     <w:p>
       <w:r>
@@ -547,33 +1194,51 @@
     <w:p/>
     <w:p>
       <w:r>
-        <w:t>describe test;</w:t>
-      </w:r>
-    </w:p>
-    <w:p/>
-    <w:p>
-      <w:r>
-        <w:t>create table grades</w:t>
-      </w:r>
-    </w:p>
-    <w:p>
-      <w:r>
-        <w:t>(g_id int primary key,</w:t>
-      </w:r>
-    </w:p>
-    <w:p>
-      <w:r>
-        <w:t>g_type varchar(20),</w:t>
-      </w:r>
-    </w:p>
-    <w:p>
-      <w:r>
-        <w:t>s_id int,</w:t>
-      </w:r>
-    </w:p>
-    <w:p>
-      <w:r>
-        <w:t>t_id int</w:t>
+        <w:t>describe skills;</w:t>
+      </w:r>
+    </w:p>
+    <w:p/>
+    <w:p>
+      <w:r>
+        <w:t xml:space="preserve">create table </w:t>
+      </w:r>
+      <w:proofErr w:type="spellStart"/>
+      <w:r>
+        <w:t>hardskills</w:t>
+      </w:r>
+      <w:proofErr w:type="spellEnd"/>
+    </w:p>
+    <w:p>
+      <w:r>
+        <w:t>(</w:t>
+      </w:r>
+    </w:p>
+    <w:p>
+      <w:proofErr w:type="spellStart"/>
+      <w:r>
+        <w:t>skill_id</w:t>
+      </w:r>
+      <w:proofErr w:type="spellEnd"/>
+      <w:r>
+        <w:t xml:space="preserve"> </w:t>
+      </w:r>
+      <w:proofErr w:type="spellStart"/>
+      <w:r>
+        <w:t>int</w:t>
+      </w:r>
+      <w:proofErr w:type="spellEnd"/>
+      <w:r>
+        <w:t>,</w:t>
+      </w:r>
+    </w:p>
+    <w:p>
+      <w:proofErr w:type="spellStart"/>
+      <w:r>
+        <w:t>technical_domain</w:t>
+      </w:r>
+      <w:proofErr w:type="spellEnd"/>
+      <w:r>
+        <w:t xml:space="preserve"> varchar(20)</w:t>
       </w:r>
     </w:p>
     <w:p>
@@ -584,7 +1249,78 @@
     <w:p/>
     <w:p>
       <w:r>
-        <w:t>describe grades;</w:t>
+        <w:t xml:space="preserve">describe </w:t>
+      </w:r>
+      <w:proofErr w:type="spellStart"/>
+      <w:r>
+        <w:t>hardskills</w:t>
+      </w:r>
+      <w:proofErr w:type="spellEnd"/>
+      <w:r>
+        <w:t>;</w:t>
+      </w:r>
+    </w:p>
+    <w:p/>
+    <w:p>
+      <w:r>
+        <w:t xml:space="preserve">create table </w:t>
+      </w:r>
+      <w:proofErr w:type="spellStart"/>
+      <w:r>
+        <w:t>softskills</w:t>
+      </w:r>
+      <w:proofErr w:type="spellEnd"/>
+    </w:p>
+    <w:p>
+      <w:r>
+        <w:t>(</w:t>
+      </w:r>
+    </w:p>
+    <w:p>
+      <w:proofErr w:type="spellStart"/>
+      <w:r>
+        <w:t>skill_id</w:t>
+      </w:r>
+      <w:proofErr w:type="spellEnd"/>
+      <w:r>
+        <w:t xml:space="preserve"> </w:t>
+      </w:r>
+      <w:proofErr w:type="spellStart"/>
+      <w:r>
+        <w:t>int</w:t>
+      </w:r>
+      <w:proofErr w:type="spellEnd"/>
+      <w:r>
+        <w:t>,</w:t>
+      </w:r>
+    </w:p>
+    <w:p>
+      <w:proofErr w:type="spellStart"/>
+      <w:r>
+        <w:t>skill_category</w:t>
+      </w:r>
+      <w:proofErr w:type="spellEnd"/>
+      <w:r>
+        <w:t xml:space="preserve"> varchar(20)</w:t>
+      </w:r>
+    </w:p>
+    <w:p>
+      <w:r>
+        <w:t>);</w:t>
+      </w:r>
+    </w:p>
+    <w:p/>
+    <w:p>
+      <w:r>
+        <w:t xml:space="preserve">describe </w:t>
+      </w:r>
+      <w:proofErr w:type="spellStart"/>
+      <w:r>
+        <w:t>softskills</w:t>
+      </w:r>
+      <w:proofErr w:type="spellEnd"/>
+      <w:r>
+        <w:t>;</w:t>
       </w:r>
       <w:bookmarkStart w:id="0" w:name="_GoBack"/>
       <w:bookmarkEnd w:id="0"/>

</xml_diff>